<commit_message>
docs: finalize release evidence and resume
</commit_message>
<xml_diff>
--- a/output/doc/KnowFlow-Agent-项目经历专项简历材料.docx
+++ b/output/doc/KnowFlow-Agent-项目经历专项简历材料.docx
@@ -39,11 +39,11 @@
       <w:hyperlink r:id="rId11">
         <w:r>
           <w:rPr>
-            <w:rFonts w:ascii="Arial" w:hAnsi="Arial" w:eastAsia="Songti SC"/>
+            <w:rFonts w:ascii="Arial Unicode MS" w:hAnsi="Arial Unicode MS" w:eastAsia="Arial Unicode MS" w:cs="Arial Unicode MS"/>
             <w:color w:val="176B87"/>
             <w:u w:val="single"/>
           </w:rPr>
-          <w:t>目标 GitHub：LJLW1/knowflow-agent</w:t>
+          <w:t>GitHub：LJLW1/knowflow-agent</w:t>
         </w:r>
       </w:hyperlink>
       <w:r>
@@ -946,7 +946,7 @@
           </w:tcPr>
           <w:p>
             <w:r>
-              <w:t>Docker 本机验收</w:t>
+              <w:t>Docker 验收</w:t>
             </w:r>
           </w:p>
         </w:tc>
@@ -965,7 +965,7 @@
           </w:tcPr>
           <w:p>
             <w:r>
-              <w:t>待测量：Compose 配置已通过，Docker Desktop daemon 未启动。</w:t>
+              <w:t>GitHub Actions Linux runner 已通过镜像构建、容器健康检查和命名卷重启持久化检查；本机 Docker Desktop 尚未启动。</w:t>
             </w:r>
           </w:p>
         </w:tc>
@@ -1003,7 +1003,7 @@
           </w:tcPr>
           <w:p>
             <w:r>
-              <w:t>待发布：目标仓库尚未创建或未授权当前会话写入。</w:t>
+              <w:t>公开仓库已发布；5 个真实 Issues 对应独立分支/PR，CI 与 Docker workflow 均为绿色。</w:t>
             </w:r>
           </w:p>
         </w:tc>
@@ -1589,7 +1589,7 @@
     </w:p>
     <w:p>
       <w:r>
-        <w:t>无 OCR/表格理解；无完整 RBAC/SSO；任务不跨进程恢复；BGE 与云模型效果尚未测量；Docker daemon 和 GitHub 远端发布仍需要本机授权/启动后完成最终验收。</w:t>
+        <w:t>无 OCR/表格理解；无完整 RBAC/SSO；任务不跨进程恢复；BGE 与云模型效果尚未测量；本机 Docker Desktop 尚未启动，但 Linux runner 已通过镜像、健康检查和重启持久化验收。</w:t>
       </w:r>
     </w:p>
     <w:p>
@@ -2020,7 +2020,7 @@
       <w:spacing w:line="259" w:lineRule="auto" w:after="60"/>
     </w:pPr>
     <w:rPr>
-      <w:rFonts w:ascii="Arial" w:hAnsi="Arial" w:eastAsia="Songti SC"/>
+      <w:rFonts w:ascii="Arial Unicode MS" w:hAnsi="Arial Unicode MS" w:eastAsia="Arial Unicode MS" w:cs="Arial Unicode MS"/>
       <w:color w:val="202A35"/>
       <w:sz w:val="18"/>
     </w:rPr>
@@ -2084,7 +2084,7 @@
       <w:outlineLvl w:val="0"/>
     </w:pPr>
     <w:rPr>
-      <w:rFonts w:asciiTheme="majorHAnsi" w:eastAsiaTheme="majorEastAsia" w:hAnsiTheme="majorHAnsi" w:cstheme="majorBidi" w:ascii="Arial" w:hAnsi="Arial" w:eastAsia="Heiti SC"/>
+      <w:rFonts w:asciiTheme="majorHAnsi" w:eastAsiaTheme="majorEastAsia" w:hAnsiTheme="majorHAnsi" w:cstheme="majorBidi" w:ascii="Arial Unicode MS" w:hAnsi="Arial Unicode MS" w:eastAsia="Arial Unicode MS" w:cs="Arial Unicode MS"/>
       <w:b/>
       <w:bCs/>
       <w:color w:val="16324F"/>
@@ -2108,7 +2108,7 @@
       <w:outlineLvl w:val="1"/>
     </w:pPr>
     <w:rPr>
-      <w:rFonts w:asciiTheme="majorHAnsi" w:eastAsiaTheme="majorEastAsia" w:hAnsiTheme="majorHAnsi" w:cstheme="majorBidi" w:ascii="Arial" w:hAnsi="Arial" w:eastAsia="Heiti SC"/>
+      <w:rFonts w:asciiTheme="majorHAnsi" w:eastAsiaTheme="majorEastAsia" w:hAnsiTheme="majorHAnsi" w:cstheme="majorBidi" w:ascii="Arial Unicode MS" w:hAnsi="Arial Unicode MS" w:eastAsia="Arial Unicode MS" w:cs="Arial Unicode MS"/>
       <w:b/>
       <w:bCs/>
       <w:color w:val="176B87"/>
@@ -2373,7 +2373,7 @@
       <w:contextualSpacing/>
     </w:pPr>
     <w:rPr>
-      <w:rFonts w:asciiTheme="majorHAnsi" w:eastAsiaTheme="majorEastAsia" w:hAnsiTheme="majorHAnsi" w:cstheme="majorBidi" w:ascii="Arial" w:hAnsi="Arial" w:eastAsia="Heiti SC"/>
+      <w:rFonts w:asciiTheme="majorHAnsi" w:eastAsiaTheme="majorEastAsia" w:hAnsiTheme="majorHAnsi" w:cstheme="majorBidi" w:ascii="Arial Unicode MS" w:hAnsi="Arial Unicode MS" w:eastAsia="Arial Unicode MS" w:cs="Arial Unicode MS"/>
       <w:b/>
       <w:color w:val="16324F"/>
       <w:spacing w:val="5"/>
@@ -2412,7 +2412,7 @@
       <w:spacing w:before="100" w:after="200"/>
     </w:pPr>
     <w:rPr>
-      <w:rFonts w:asciiTheme="majorHAnsi" w:eastAsiaTheme="majorEastAsia" w:hAnsiTheme="majorHAnsi" w:cstheme="majorBidi" w:ascii="Arial" w:hAnsi="Arial" w:eastAsia="Songti SC"/>
+      <w:rFonts w:asciiTheme="majorHAnsi" w:eastAsiaTheme="majorEastAsia" w:hAnsiTheme="majorHAnsi" w:cstheme="majorBidi" w:ascii="Arial Unicode MS" w:hAnsi="Arial Unicode MS" w:eastAsia="Arial Unicode MS" w:cs="Arial Unicode MS"/>
       <w:b w:val="0"/>
       <w:i/>
       <w:iCs/>

</xml_diff>